<commit_message>
Fix Cipollone attribution: correct source doc and verbatim quote
Co-Authored-By: Claude Fable 5 <noreply@anthropic.com>
Claude-Session: https://claude.ai/code/session_013vdqxU36ZXW49sd1YxFc7q
</commit_message>
<xml_diff>
--- a/content/stablecoin-regulation/article/The-Underlying-Currency-Dominance-War-Stablecoin-Regulation.docx
+++ b/content/stablecoin-regulation/article/The-Underlying-Currency-Dominance-War-Stablecoin-Regulation.docx
@@ -363,7 +363,7 @@
         <w:t>14</w:t>
       </w:r>
       <w:r>
-        <w:t xml:space="preserve">. ECB board member Piero Cipollone is more explicit: US stablecoin policy could pull euro deposits to America and "compromise our monetary sovereignty" </w:t>
+        <w:t xml:space="preserve">. ECB board member Piero Cipollone is more explicit: dependence on foreign stablecoins "excessively undermines resilience and compromises monetary sovereignty," and he has warned that US dollar-stablecoin promotion risks shifting euro deposits, payment fees and data to America </w:t>
       </w:r>
       <w:r>
         <w:rPr>
@@ -1316,7 +1316,7 @@
         <w:rPr>
           <w:sz w:val="18"/>
         </w:rPr>
-        <w:t>Piero Cipollone, "Digital euro: the future of money," speech and European Parliament ECON statement (April 7-8, 2025), ECB: US dollar-stablecoin promotion could move euro deposits to the US and "compromise [Europe's] monetary sovereignty"; a digital euro would "prevent foreign currency stablecoins from becoming widely used in the euro area."</w:t>
+        <w:t>Piero Cipollone, introductory statement at the ECON Committee of the European Parliament (April 8, 2025), reprinted as "Empowering Europe: boosting strategic autonomy through the digital euro" (BIS Review r250409f). Verbatim: reliance "could evolve into dependence on other private means of payment such as foreign stablecoins, which excessively undermines resilience and compromises monetary sovereignty." The deposit/fee/data-shift warning paraphrases his April 2025 remarks as reported in press coverage. See also his speech "Stablecoins and monetary sovereignty" (ECB, October 18, 2025).</w:t>
       </w:r>
     </w:p>
     <w:p>

</xml_diff>

<commit_message>
Safety check: verify 26 claims, fix 3 errors, hedge 7 nuances; add routine rules
Adversarial verification pass (3 agents) over all quotes, statistics and
statutory claims. Corrections: Citi report title, Circle Treasury figure,
BIS report year/test-set, Tether quarter conflation, Bessent forecast
framing, survey wording, StanChart revision, euro-segment staleness,
Coinbase sequencing, Tether profit composition. Adds verification-report.md
and CONTENT-ROUTINE.md with mandatory quote/verification rules.

Co-Authored-By: Claude Fable 5 <noreply@anthropic.com>
Claude-Session: https://claude.ai/code/session_013vdqxU36ZXW49sd1YxFc7q
</commit_message>
<xml_diff>
--- a/content/stablecoin-regulation/article/The-Underlying-Currency-Dominance-War-Stablecoin-Regulation.docx
+++ b/content/stablecoin-regulation/article/The-Underlying-Currency-Dominance-War-Stablecoin-Regulation.docx
@@ -47,13 +47,13 @@
         <w:t>99% of the ~$300 billion stablecoin market is pegged to the US dollar</w:t>
       </w:r>
       <w:r>
-        <w:t xml:space="preserve">. Euro stablecoins? About </w:t>
+        <w:t xml:space="preserve">. Euro stablecoins? </w:t>
       </w:r>
       <w:r>
         <w:rPr>
           <w:b/>
         </w:rPr>
-        <w:t>€450 million, less than 0.2% of the market</w:t>
+        <w:t>Well under €1 billion, less than 0.2% of the market</w:t>
       </w:r>
       <w:r>
         <w:t xml:space="preserve"> </w:t>
@@ -70,13 +70,13 @@
     </w:p>
     <w:p>
       <w:r>
-        <w:t xml:space="preserve">And the money is not idle. Under its December 2025 attestation, Tether alone held about </w:t>
+        <w:t xml:space="preserve">And the money is not idle. Tether's end-2025 attestation reported a record </w:t>
       </w:r>
       <w:r>
         <w:rPr>
           <w:b/>
         </w:rPr>
-        <w:t>$122 billion in US Treasury bills, making it the 17th-largest holder of US government debt, ahead of Germany</w:t>
+        <w:t>~$141 billion of exposure to US Treasuries ($122 billion held directly) — more than Germany's entire holdings of US debt, placing Tether among the top twenty holders worldwide</w:t>
       </w:r>
       <w:r>
         <w:t xml:space="preserve"> </w:t>
@@ -88,7 +88,7 @@
         <w:t>2</w:t>
       </w:r>
       <w:r>
-        <w:t xml:space="preserve">. Add Circle's ~$48 billion </w:t>
+        <w:t xml:space="preserve">. Add Circle's ~$65 billion </w:t>
       </w:r>
       <w:r>
         <w:rPr>
@@ -156,7 +156,7 @@
         <w:t>5</w:t>
       </w:r>
       <w:r>
-        <w:t xml:space="preserve">. He projects a </w:t>
+        <w:t xml:space="preserve">. He has amplified projections of a </w:t>
       </w:r>
       <w:r>
         <w:rPr>
@@ -212,7 +212,7 @@
         <w:rPr>
           <w:b/>
         </w:rPr>
-        <w:t>47% of stablecoin users said their primary reason is simply "to access dollars"</w:t>
+        <w:t>47% of stablecoin users cited "access to dollars" as a main reason for using them</w:t>
       </w:r>
       <w:r>
         <w:t xml:space="preserve"> </w:t>
@@ -691,7 +691,7 @@
         <w:t>19</w:t>
       </w:r>
       <w:r>
-        <w:t xml:space="preserve">. The Bank for International Settlements — the Basel-based "central bank of central banks" — argues stablecoins fail the basic tests of money (singleness, elasticity, integrity) and trade more like ETFs </w:t>
+        <w:t xml:space="preserve">. The Bank for International Settlements — the Basel-based "central bank of central banks" — argues stablecoins fail the basic tests of money — singleness, elasticity, integrity, with interoperability added in its 2026 update — and trade more like ETFs </w:t>
       </w:r>
       <w:r>
         <w:rPr>
@@ -962,7 +962,7 @@
         <w:t>entire business model</w:t>
       </w:r>
       <w:r>
-        <w:t xml:space="preserve">. Tether's ~$10B+ profit in 2025 and Circle's revenue are, at bottom, T-bill coupons on other people's money </w:t>
+        <w:t xml:space="preserve">. Tether's ~$10B+ profit in 2025 and Circle's revenue are, at bottom, largely T-bill coupons on other people's money </w:t>
       </w:r>
       <w:r>
         <w:rPr>
@@ -1064,7 +1064,7 @@
         <w:rPr>
           <w:sz w:val="18"/>
         </w:rPr>
-        <w:t>Market-cap trackers (DefiLlama-derived) and Forbes, "Will USD-Backed Stablecoins Always Dominate The Market?" (June 29, 2026): USD-pegged share reported at 97-99%+ of a ~$290-320B market depending on methodology. Euro segment ~€450-500M: ECB data cited via FXStreet; Forbes, "Euro Stablecoins Are Scaling While The Digital Euro Waits On Brussels" (June 4, 2026).</w:t>
+        <w:t>Market-cap trackers (DefiLlama: ~$315B, USD share ~99%, late June 2026) and Forbes, "Will USD-Backed Stablecoins Always Dominate The Market?" (June 29, 2026); some trackers report 97% — methodology-dependent. Euro segment: ~€450-500M in late 2025, growing toward €700-900M by mid-2026 — still under 0.2% of the market (Forbes, "Euro Stablecoins Are Scaling While The Digital Euro Waits On Brussels," June 4, 2026; EURC Q1 2026 reports).</w:t>
       </w:r>
     </w:p>
     <w:p>
@@ -1082,7 +1082,7 @@
         <w:rPr>
           <w:sz w:val="18"/>
         </w:rPr>
-        <w:t>Tether Q4 2025 attestation (BDO), reporting ~$122.3B in direct T-bill holdings (~83% of reserves) as of Dec 31, 2025, with total US Treasury exposure claimed above $135B. Ranking vs. sovereign holders (17th, ahead of Germany at ~$110B): Yahoo Finance / Blockhead (Nov 2025). Caveat: self-reported attestation, not a full audit.</w:t>
+        <w:t>Tether Q4 2025 attestation (BDO, Dec 31, 2025): ~$122B direct US Treasury holdings, ~$141B total exposure including indirect. Sovereign-holder comparisons come from different quarters: Tether's Q3 2025 attestation claimed 17th place (~$135B, surpassing South Korea); the Germany comparison (~$111B) dates to Q1 2025. "Ahead of Germany, top-twenty holder" holds across all of them. Caveats: self-reported attestation, not a full audit.</w:t>
       </w:r>
     </w:p>
     <w:p>
@@ -1100,7 +1100,7 @@
         <w:rPr>
           <w:sz w:val="18"/>
         </w:rPr>
-        <w:t>Columbia Economic Review, "Digitalizing Dominance: How the GENIUS Act Reinforces US Dollar Hegemony" (2025), citing ~$48B in Treasuries and Treasury-backed instruments held by Circle.</w:t>
+        <w:t>Circle Reserve Fund (BlackRock-managed, short-dated Treasuries and Treasury repo): ~$68B as of mid-2026, with ~80% of USDC's ~$78B reserves in Treasury instruments (BlackRock fund page; Circle transparency page). Earlier snapshots (~$48B) circulated in 2025 commentary, e.g. Columbia Economic Review, "Digitalizing Dominance" (2025).</w:t>
       </w:r>
     </w:p>
     <w:p>
@@ -1154,7 +1154,7 @@
         <w:rPr>
           <w:sz w:val="18"/>
         </w:rPr>
-        <w:t>Scott Bessent on X (June 17, 2025): "stablecoins could grow into a $3.7 trillion market by the end of the decade." He separately told the Senate Appropriations Committee (June 2025) the market "could exceed $2 trillion by 2028" — the two figures are different horizons, not a contradiction.</w:t>
+        <w:t>Scott Bessent on X (June 17, 2025), verbatim: "Recent reporting projects that stablecoins could grow into a $3.7 trillion market by the end of the decade" — he amplified analyst projections rather than issuing his own forecast. He separately told a Senate Appropriations subcommittee (June 2025) the market could exceed $2 trillion by 2028, adding "I could see it greatly exceeding that."</w:t>
       </w:r>
     </w:p>
     <w:p>
@@ -1172,7 +1172,7 @@
         <w:rPr>
           <w:sz w:val="18"/>
         </w:rPr>
-        <w:t>Standard Chartered digital-assets research (Geoff Kendrick, 2025), as reported by The Block and FinanceFeeds: a $2T stablecoin market by end-2028 would require ~$1.6T of additional T-bill purchases, roughly equal to all planned net new T-bill issuance over the period. See also the Treasury Borrowing Advisory Committee "Digital Money" presentation (April 30, 2025), which models the ~$2T-by-2028 scenario.</w:t>
+        <w:t>Standard Chartered digital-assets research (Geoff Kendrick with John Davies, April 2025): a $2T stablecoin market by end-2028 would require ~$1.6T of additional T-bill purchases, roughly equal to planned net new T-bill issuance over the period. Note: in February 2026 Standard Chartered trimmed the T-bill demand estimate to ~$0.8-1.0T while keeping the $2T market target. See also the Treasury Borrowing Advisory Committee "Digital Money" presentation (April 30, 2025).</w:t>
       </w:r>
     </w:p>
     <w:p>
@@ -1190,7 +1190,7 @@
         <w:rPr>
           <w:sz w:val="18"/>
         </w:rPr>
-        <w:t>Citi GPS, "Stablecoins 2030" (April 2025; base case $1.6T, bull case $3.7T, later revised to $1.9T/$4.0T): stablecoin issuers could hold ~$1.2T in US government debt by 2030, potentially exceeding every single foreign sovereign holder.</w:t>
+        <w:t>Citi GPS, "Digital Dollars" (April 2025): base case $1.6T, bull case $3.7T by 2030; stablecoin issuers could hold ~$1.2T in US government debt by 2030, potentially exceeding every single foreign sovereign holder. The follow-up report "Stablecoins 2030" (September 2025) revised the cases to $1.9T base / $4.0T bull.</w:t>
       </w:r>
     </w:p>
     <w:p>
@@ -1208,7 +1208,7 @@
         <w:rPr>
           <w:sz w:val="18"/>
         </w:rPr>
-        <w:t>Castle Island Ventures / Brevan Howard Digital, EM stablecoin survey (2024): 2,541 users across Nigeria, India, Indonesia, Turkey, Brazil; 47% cited "access to dollars" as a primary reason for holding stablecoins. Argentina: Chainalysis 2025 Global Crypto Adoption Index (stablecoins &gt;50% of exchange purchase volume).</w:t>
+        <w:t>Castle Island Ventures / Brevan Howard Digital (with Visa and Artemis, YouGov fieldwork May-June 2024): 2,541 crypto users across Nigeria, India, Indonesia, Turkey, Brazil; 47% cited "access to dollars" as a reason for using stablecoins — the second most-cited use after crypto trading (50%), in a multi-select question. Argentina: Chainalysis Latin America reports (stablecoins &gt;50% of peso exchange purchases; 61.8% of transaction volume vs 44.7% global average).</w:t>
       </w:r>
     </w:p>
     <w:p>
@@ -1262,7 +1262,7 @@
         <w:rPr>
           <w:sz w:val="18"/>
         </w:rPr>
-        <w:t>ESMA statement ESMA75-223375936-6099 (Jan 17, 2025): acquisition restrictions by end-Jan 2025, sell-only until March 31, 2025. Exchange actions: Coinbase (Dec 2024), Crypto.com (Jan 31, 2025), Kraken (Mar 24-31, 2025), Binance (nine stablecoins incl. USDT, by Mar 31, 2025) — The Block, DL News, exchange announcements.</w:t>
+        <w:t>ESMA statement ESMA75-223375936-6099 (Jan 17, 2025): acquisition restrictions by end-Jan 2025, sell-only until March 31, 2025. Exchange actions: Coinbase moved first (Dec 2024, ahead of the statement), then Crypto.com (Jan 31, 2025), Kraken (Mar 24-31, 2025), Binance (nine stablecoins incl. USDT, by Mar 31, 2025) — The Block, DL News, exchange announcements.</w:t>
       </w:r>
     </w:p>
     <w:p>
@@ -1568,7 +1568,7 @@
         <w:rPr>
           <w:sz w:val="18"/>
         </w:rPr>
-        <w:t>Tether reported &gt;$10B profit year-to-date in November 2025 (company attestation, via Blockhead/Yahoo Finance); Circle's revenue is predominantly reserve interest income (Circle public filings).</w:t>
+        <w:t>Tether reported &gt;$10B net profit for 2025 (Q4 attestation) — driven mainly by reserve yields, though 2025 results also include gold (~$17B held) and bitcoin gains. Circle: 99% of 2024 revenue ($1.66B of $1.68B) was reserve interest income (Circle S-1).</w:t>
       </w:r>
     </w:p>
     <w:p>

</xml_diff>

<commit_message>
Reconcile article with primary texts: clause (ii) euro deposits, FDIC bank check, Anti-CBDC inversion
Co-Authored-By: Claude Fable 5 <noreply@anthropic.com>
Claude-Session: https://claude.ai/code/session_013vdqxU36ZXW49sd1YxFc7q
</commit_message>
<xml_diff>
--- a/content/stablecoin-regulation/article/The-Underlying-Currency-Dominance-War-Stablecoin-Regulation.docx
+++ b/content/stablecoin-regulation/article/The-Underlying-Currency-Dominance-War-Stablecoin-Regulation.docx
@@ -395,7 +395,16 @@
         <w:t>16</w:t>
       </w:r>
       <w:r>
-        <w:t>.</w:t>
+        <w:t xml:space="preserve">. And note the perfect inversion across the Atlantic: the House-passed CLARITY Act carries a title literally named the "Anti-CBDC Surveillance State Act," banning the Federal Reserve from offering a retail digital dollar </w:t>
+      </w:r>
+      <w:r>
+        <w:rPr>
+          <w:vertAlign w:val="superscript"/>
+        </w:rPr>
+        <w:t>32</w:t>
+      </w:r>
+      <w:r>
+        <w:t>. Europe is building a public digital currency to defend against private dollar coins; America is banning its public option to clear the field for them.</w:t>
       </w:r>
     </w:p>
     <w:p>
@@ -903,7 +912,7 @@
         <w:t>exhaustive</w:t>
       </w:r>
       <w:r>
-        <w:t xml:space="preserve">, and every item on it is American: US coins and currency, deposits at insured US banks, </w:t>
+        <w:t xml:space="preserve">, and all but one item on it is dollar-locked: US coins and currency, </w:t>
       </w:r>
       <w:r>
         <w:rPr>
@@ -921,7 +930,25 @@
         <w:t>4</w:t>
       </w:r>
       <w:r>
-        <w:t xml:space="preserve">. The only interest-bearing assets a GENIUS issuer may hold are </w:t>
+        <w:t xml:space="preserve">. The single currency-flexible bucket is bank deposits — the deposit clause names no currency, so euro deposits at an insured US bank (including its foreign branches) are technically permitted </w:t>
+      </w:r>
+      <w:r>
+        <w:rPr>
+          <w:vertAlign w:val="superscript"/>
+        </w:rPr>
+        <w:t>31</w:t>
+      </w:r>
+      <w:r>
+        <w:t xml:space="preserve">. But that is the entire euro menu. The only interest-bearing </w:t>
+      </w:r>
+      <w:r>
+        <w:rPr>
+          <w:i/>
+        </w:rPr>
+        <w:t>securities</w:t>
+      </w:r>
+      <w:r>
+        <w:t xml:space="preserve"> a GENIUS issuer may hold are </w:t>
       </w:r>
       <w:r>
         <w:rPr>
@@ -971,7 +998,25 @@
         <w:t>29</w:t>
       </w:r>
       <w:r>
-        <w:t>. A euro stablecoin under the GENIUS Act would face an impossible choice: hold dollar T-bills against a euro peg (a currency mismatch that breaks the coin), or hold non-earning euro cash (a business with no revenue). The dollar coin gets a yield engine by statute; the euro coin gets a cost center.</w:t>
+        <w:t xml:space="preserve">. A euro stablecoin under the GENIUS Act would face an impossible menu: hold dollar T-bills against a euro peg (a currency mismatch that breaks the coin), or cram the entire reserve into euro bank deposits — largely uninsured (FDIC coverage stops at foreign branches), capped under proposed rules at 40% per bank, and, per the FDIC's own database, with only </w:t>
+      </w:r>
+      <w:r>
+        <w:rPr>
+          <w:b/>
+        </w:rPr>
+        <w:t>five of Europe's thirty largest banks</w:t>
+      </w:r>
+      <w:r>
+        <w:t xml:space="preserve"> even owning an eligible US insured bank </w:t>
+      </w:r>
+      <w:r>
+        <w:rPr>
+          <w:vertAlign w:val="superscript"/>
+        </w:rPr>
+        <w:t>31</w:t>
+      </w:r>
+      <w:r>
+        <w:t>. De jure permitted; de facto impossible at scale. The dollar coin gets a yield engine by statute; the euro coin gets a compliance labyrinth with no revenue.</w:t>
       </w:r>
     </w:p>
     <w:p>
@@ -1118,7 +1163,20 @@
         <w:rPr>
           <w:sz w:val="18"/>
         </w:rPr>
-        <w:t>GENIUS Act, Pub. L. 119-27, Sec. 4(a)(1): permitted reserves limited to US coins and currency; insured demand deposits; US Treasury bills/notes/bonds with remaining maturity ≤93 days; Treasury-backed repurchase/reverse-repurchase agreements; government money market funds invested in the foregoing; central bank reserve deposits; and tokenized equivalents. See also Gibson Dunn, "The GENIUS Act: A New Era of Stablecoin Regulation" (July 2025), section-by-section appendix.</w:t>
+        <w:t xml:space="preserve">GENIUS Act, Pub. L. 119-27, Sec. 4(a)(1)(A) (codified at 12 U.S.C. 5903): permitted reserves limited to US coins and currency; demand deposits at insured depository institutions; US Treasury bills/notes/bonds with remaining maturity ≤93 days; Treasury-backed repurchase/reverse-repurchase agreements; government money market funds invested in the foregoing; central bank reserve deposits; regulator-approved "similarly liquid Federal Government-issued" assets; and tokenized equivalents. Note: only the deposit clause (ii) states no currency — see </w:t>
+      </w:r>
+      <w:r>
+        <w:rPr>
+          <w:sz w:val="18"/>
+          <w:vertAlign w:val="superscript"/>
+        </w:rPr>
+        <w:t>31</w:t>
+      </w:r>
+      <w:r>
+        <w:rPr>
+          <w:sz w:val="18"/>
+        </w:rPr>
+        <w:t>. See also Gibson Dunn, "The GENIUS Act: A New Era of Stablecoin Regulation" (July 2025).</w:t>
       </w:r>
     </w:p>
     <w:p>
@@ -1532,7 +1590,7 @@
         <w:rPr>
           <w:sz w:val="18"/>
         </w:rPr>
-        <w:t>GENIUS Act Sec. 2 definitions: "payment stablecoin" is defined by redemption for a fixed amount of "monetary value" — a term covering national currencies generally, not the US dollar specifically.</w:t>
+        <w:t>GENIUS Act Sec. 2 definitions: "payment stablecoin" is defined by redemption for a fixed amount of "monetary value" (Sec. 2(17)), and "national currency" expressly includes "money issued by a foreign central bank" (Sec. 2(19)(C)) — so a euro (ECB) peg fits the definition; the exclusion list (national currencies, deposits, securities) does not bar foreign pegs.</w:t>
       </w:r>
     </w:p>
     <w:p>
@@ -1600,6 +1658,42 @@
           <w:sz w:val="18"/>
         </w:rPr>
         <w:t>. Rate differential: ECB deposit facility ~2% vs. US federal funds ~4% across 2025-26 (central bank policy rates).</w:t>
+      </w:r>
+    </w:p>
+    <w:p>
+      <w:pPr>
+        <w:spacing w:after="120"/>
+      </w:pPr>
+      <w:r>
+        <w:rPr>
+          <w:b/>
+          <w:sz w:val="18"/>
+        </w:rPr>
+        <w:t xml:space="preserve">31. </w:t>
+      </w:r>
+      <w:r>
+        <w:rPr>
+          <w:sz w:val="18"/>
+        </w:rPr>
+        <w:t>GENIUS Act Sec. 4(a)(1)(A)(ii) (12 U.S.C. 5903): the bank-deposit clause specifies no currency — the reserve list's only non-USD bucket. Practical constraints: obligations payable solely at foreign branches are generally not insured deposits (FDI Act); the FDIC's proposed rule caps any single institution at 40% of reserves (§350.4(f)) and the OCC proposal adds an insured-deposit floor and a USD operational backstop (§§15.11(d), 15.41(b)(2)). FDIC BankFind check (index July 3, 2026): only 5 of Europe's 30 largest banking groups — HSBC, Santander, Barclays, UBS, Deutsche Bank — have an active FDIC-insured US depository institution, several of them trust or card banks.</w:t>
+      </w:r>
+    </w:p>
+    <w:p>
+      <w:pPr>
+        <w:spacing w:after="120"/>
+      </w:pPr>
+      <w:r>
+        <w:rPr>
+          <w:b/>
+          <w:sz w:val="18"/>
+        </w:rPr>
+        <w:t xml:space="preserve">32. </w:t>
+      </w:r>
+      <w:r>
+        <w:rPr>
+          <w:sz w:val="18"/>
+        </w:rPr>
+        <w:t>CLARITY Act, H.R. 3633 (119th Cong.), Title VI, "Anti-CBDC Surveillance State Act" — engrossed House text, passed July 17, 2025, pending in the Senate as of mid-2026: prohibits Federal Reserve banks from offering certain products or services directly to individuals and bars use of a central bank digital currency for monetary policy.</w:t>
       </w:r>
     </w:p>
     <w:p>

</xml_diff>

<commit_message>
Add second USDT delisting wave: Revolut staged removal (Jul-Aug 2026), fn [33]
Co-Authored-By: Claude Fable 5 <noreply@anthropic.com>
Claude-Session: https://claude.ai/code/session_013vdqxU36ZXW49sd1YxFc7q
</commit_message>
<xml_diff>
--- a/content/stablecoin-regulation/article/The-Underlying-Currency-Dominance-War-Stablecoin-Regulation.docx
+++ b/content/stablecoin-regulation/article/The-Underlying-Currency-Dominance-War-Stablecoin-Regulation.docx
@@ -761,6 +761,15 @@
           <w:vertAlign w:val="superscript"/>
         </w:rPr>
         <w:t>12</w:t>
+      </w:r>
+      <w:r>
+        <w:t xml:space="preserve">. And the wall is still closing: with MiCA's final transition window shut on July 1, 2026, the fintech Revolut is now removing USDT for its European users in stages — purchases blocked July 6, deposits off July 30, full delisting August 31, 2026, with any leftover balances auto-converted to fiat </w:t>
+      </w:r>
+      <w:r>
+        <w:rPr>
+          <w:vertAlign w:val="superscript"/>
+        </w:rPr>
+        <w:t>33</w:t>
       </w:r>
       <w:r>
         <w:t xml:space="preserve">. </w:t>
@@ -1697,6 +1706,24 @@
       </w:r>
     </w:p>
     <w:p>
+      <w:pPr>
+        <w:spacing w:after="120"/>
+      </w:pPr>
+      <w:r>
+        <w:rPr>
+          <w:b/>
+          <w:sz w:val="18"/>
+        </w:rPr>
+        <w:t xml:space="preserve">33. </w:t>
+      </w:r>
+      <w:r>
+        <w:rPr>
+          <w:sz w:val="18"/>
+        </w:rPr>
+        <w:t>Revolut staged USDT delisting for EU users: purchases blocked July 6, 2026; deposits disabled July 30, 2026; full delisting August 31, 2026, with residual balances auto-converted to the user's base currency at market rate — Yahoo Finance, BeInCrypto, The Paypers (July 4-5, 2026). Timing follows the expiry of MiCA's Art. 143(3) CASP grandfathering window (July 1, 2026). August 31 is Revolut's own schedule, not an EU-wide statutory date.</w:t>
+      </w:r>
+    </w:p>
+    <w:p>
       <w:r>
         <w:rPr>
           <w:b/>

</xml_diff>